<commit_message>
Update AddRmsNorm timing matrix evidence
</commit_message>
<xml_diff>
--- a/third_party/ascend/tutorials/add_rms_norm/AddRmsNorm算子设计方案.docx
+++ b/third_party/ascend/tutorials/add_rms_norm/AddRmsNorm算子设计方案.docx
@@ -4,28 +4,25 @@
   <w:body>
     <w:p>
       <w:pPr>
-        <w:jc w:val="center"/>
+        <w:pStyle w:val="af2"/>
       </w:pPr>
       <w:r>
         <w:rPr>
-          <w:rFonts w:ascii="SimSun" w:hAnsi="SimSun" w:eastAsia="SimSun"/>
           <w:b/>
-          <w:sz w:val="32"/>
+          <w:sz w:val="36"/>
         </w:rPr>
         <w:t>AddRmsNorm算子设计方案</w:t>
       </w:r>
     </w:p>
     <w:p>
       <w:pPr>
-        <w:jc w:val="center"/>
+        <w:pStyle w:val="af3"/>
       </w:pPr>
       <w:r>
         <w:rPr>
-          <w:rFonts w:ascii="SimSun" w:hAnsi="SimSun" w:eastAsia="SimSun"/>
           <w:b w:val="0"/>
-          <w:sz w:val="20"/>
         </w:rPr>
-        <w:t>适配硬件：Atlas A2推理系列产品；开发语言：Triton（基于Triton-Ascend）；CANN版本：9.0.0验证环境。</w:t>
+        <w:t>适配硬件：Atlas A2推理系列产品；开发语言：Triton-Ascend；CANN版本：9.0.0验证环境。</w:t>
       </w:r>
     </w:p>
     <w:p>
@@ -34,135 +31,229 @@
       </w:pPr>
       <w:r>
         <w:rPr>
-          <w:rFonts w:ascii="SimSun" w:hAnsi="SimSun" w:eastAsia="SimSun"/>
+          <w:b/>
+        </w:rPr>
+        <w:t>1. 需求分析</w:t>
+      </w:r>
+    </w:p>
+    <w:p>
+      <w:pPr>
+        <w:pStyle w:val="af3"/>
+      </w:pPr>
+      <w:r>
+        <w:rPr>
           <w:b w:val="0"/>
-          <w:sz w:val="20"/>
         </w:rPr>
-        <w:t>需求分析</w:t>
-      </w:r>
-    </w:p>
-    <w:p>
-      <w:pPr>
-        <w:pStyle w:val="2"/>
+        <w:t>AddRmsNorm用于Transformer类模型中的残差相加与RMS归一化融合计算。本实现聚焦yOut输出，公式为 z = x1 + x2；yOut = z * rsqrt(mean(z * z, axis=-1, keepdims=True) + epsilon) * gamma。CANN接口中的xOut、rstdOut等辅助输出不属于本次交付范围。</w:t>
+      </w:r>
+    </w:p>
+    <w:p>
+      <w:pPr>
+        <w:pStyle w:val="1"/>
       </w:pPr>
       <w:r>
         <w:rPr>
-          <w:rFonts w:ascii="SimSun" w:hAnsi="SimSun" w:eastAsia="SimSun"/>
+          <w:b/>
+        </w:rPr>
+        <w:t>2. 接口与形状覆盖</w:t>
+      </w:r>
+    </w:p>
+    <w:p>
+      <w:pPr>
+        <w:pStyle w:val="af3"/>
+      </w:pPr>
+      <w:r>
+        <w:rPr>
           <w:b w:val="0"/>
-          <w:sz w:val="20"/>
         </w:rPr>
-        <w:t>AddRmsNorm算子现状分析</w:t>
-      </w:r>
-    </w:p>
-    <w:p>
+        <w:t>接口原型：add_rms_norm(x1: Tensor, x2: Tensor, gamma: Tensor, epsilon: float = 1e-6) -&gt; Tensor。</w:t>
+      </w:r>
+    </w:p>
+    <w:p>
+      <w:pPr>
+        <w:pStyle w:val="af3"/>
+      </w:pPr>
       <w:r>
         <w:rPr>
-          <w:rFonts w:ascii="SimSun" w:hAnsi="SimSun" w:eastAsia="SimSun"/>
           <w:b w:val="0"/>
-          <w:sz w:val="20"/>
         </w:rPr>
-        <w:t>AddRmsNorm用于Transformer类模型中的残差相加与RMS归一化融合计算。CANN接口aclnnAddRmsNorm提供相同核心语义，本任务要求在昇腾NPU上基于Triton-Ascend实现等价功能，并支持bfloat16推理场景。</w:t>
-      </w:r>
-    </w:p>
-    <w:p>
+        <w:t>公开风格验证覆盖 B in {1,8,16,32,64}、S in {1,8,32,128}、H in {3584,4096,5120,8192}，共80个BF16 case。</w:t>
+      </w:r>
+    </w:p>
+    <w:p>
+      <w:pPr>
+        <w:pStyle w:val="1"/>
+      </w:pPr>
       <w:r>
         <w:rPr>
-          <w:rFonts w:ascii="SimSun" w:hAnsi="SimSun" w:eastAsia="SimSun"/>
+          <w:b/>
+        </w:rPr>
+        <w:t>3. Kernel设计</w:t>
+      </w:r>
+    </w:p>
+    <w:p>
+      <w:pPr>
+        <w:pStyle w:val="af3"/>
+      </w:pPr>
+      <w:r>
+        <w:rPr>
           <w:b w:val="0"/>
-          <w:sz w:val="20"/>
         </w:rPr>
-        <w:t>本实现聚焦需求中的yOut输出，计算公式为：z = x1 + x2；yOut = z * rsqrt(mean(z * z, axis=-1, keepdims=True) + epsilon) * gamma。CANN接口中的xOut、rstdOut等辅助输出不属于本次交付范围。</w:t>
-      </w:r>
-    </w:p>
-    <w:p>
+        <w:t>• 输入校验：x1、x2、gamma必须是NPU上的连续BF16三维张量，形状一致；epsilon为正数。</w:t>
+      </w:r>
+    </w:p>
+    <w:p>
+      <w:pPr>
+        <w:pStyle w:val="af3"/>
+      </w:pPr>
       <w:r>
         <w:rPr>
-          <w:rFonts w:ascii="SimSun" w:hAnsi="SimSun" w:eastAsia="SimSun"/>
           <w:b w:val="0"/>
-          <w:sz w:val="20"/>
         </w:rPr>
-        <w:t>当前实现分析、算子整体流程（图）</w:t>
-      </w:r>
-    </w:p>
-    <w:p>
-      <w:pPr>
-        <w:pStyle w:val="af9"/>
+        <w:t>• H &lt;= 4096 使用单个融合Triton kernel。</w:t>
+      </w:r>
+    </w:p>
+    <w:p>
+      <w:pPr>
+        <w:pStyle w:val="af3"/>
       </w:pPr>
       <w:r>
         <w:rPr>
-          <w:rFonts w:ascii="SimSun" w:hAnsi="SimSun" w:eastAsia="SimSun"/>
-          <w:sz w:val="20"/>
+          <w:b w:val="0"/>
         </w:rPr>
-        <w:t>输入校验：检查x1、x2、gamma均为NPU上的连续BF16三维张量，且形状一致；epsilon必须为正数。</w:t>
-      </w:r>
-    </w:p>
-    <w:p>
-      <w:pPr>
-        <w:pStyle w:val="af9"/>
+        <w:t>• 4096 &lt; H 且 next_power_of_2(H) &lt;= 8192 使用两个Triton kernel，先计算FP32 rstd，再写出yOut。</w:t>
+      </w:r>
+    </w:p>
+    <w:p>
+      <w:pPr>
+        <w:pStyle w:val="af3"/>
       </w:pPr>
       <w:r>
         <w:rPr>
-          <w:rFonts w:ascii="SimSun" w:hAnsi="SimSun" w:eastAsia="SimSun"/>
-          <w:sz w:val="20"/>
+          <w:b w:val="0"/>
         </w:rPr>
-        <w:t>shape展开：将[B,S,H]展平为B*S个独立row，每个row沿hidden维做RMS归一化。</w:t>
-      </w:r>
-    </w:p>
-    <w:p>
-      <w:pPr>
-        <w:pStyle w:val="af9"/>
+        <w:t>• 更宽H使用8192 hidden元素分块的partial-sum/reduce/apply同后端路径。</w:t>
+      </w:r>
+    </w:p>
+    <w:p>
+      <w:pPr>
+        <w:pStyle w:val="af3"/>
       </w:pPr>
       <w:r>
         <w:rPr>
-          <w:rFonts w:ascii="SimSun" w:hAnsi="SimSun" w:eastAsia="SimSun"/>
-          <w:sz w:val="20"/>
+          <w:b w:val="0"/>
         </w:rPr>
-        <w:t>kernel分发：根据H和next_power_of_2(H)选择融合路径、双kernel路径或分块路径。</w:t>
-      </w:r>
-    </w:p>
-    <w:p>
-      <w:pPr>
-        <w:pStyle w:val="af9"/>
+        <w:t>• 所有被测计算都在Triton-Ascend JIT kernel中完成，输出写回BF16 yOut。</w:t>
+      </w:r>
+    </w:p>
+    <w:p>
+      <w:pPr>
+        <w:pStyle w:val="1"/>
       </w:pPr>
       <w:r>
         <w:rPr>
-          <w:rFonts w:ascii="SimSun" w:hAnsi="SimSun" w:eastAsia="SimSun"/>
-          <w:sz w:val="20"/>
+          <w:b/>
         </w:rPr>
-        <w:t>输出写回：所有计算路径均由Triton-Ascend JIT kernel完成被测计算，并写回BF16 yOut。</w:t>
-      </w:r>
-    </w:p>
-    <w:p>
-      <w:pPr>
-        <w:pStyle w:val="2"/>
+        <w:t>4. 精度设计</w:t>
+      </w:r>
+    </w:p>
+    <w:p>
+      <w:pPr>
+        <w:pStyle w:val="af3"/>
       </w:pPr>
       <w:r>
         <w:rPr>
-          <w:rFonts w:ascii="SimSun" w:hAnsi="SimSun" w:eastAsia="SimSun"/>
           <w:b w:val="0"/>
-          <w:sz w:val="20"/>
         </w:rPr>
-        <w:t>算子原型</w:t>
-      </w:r>
-    </w:p>
-    <w:p>
+        <w:t>验证脚本复刻BF16检查口径：阈值为2^-7 = 0.0078125，普通位置要求MERE &lt; threshold且MARE &lt; 10 * threshold，小值或抵消位置使用checker的ErrorCount规则。Triton候选在80个公开风格case上80/80通过；手动泛化审计manual_generalization_audit_40_fixed_20260612_155512为40/40通过。</w:t>
+      </w:r>
+    </w:p>
+    <w:p>
+      <w:pPr>
+        <w:pStyle w:val="1"/>
+      </w:pPr>
       <w:r>
         <w:rPr>
-          <w:rFonts w:ascii="SimSun" w:hAnsi="SimSun" w:eastAsia="SimSun"/>
+          <w:b/>
+        </w:rPr>
+        <w:t>5. 无fallback边界</w:t>
+      </w:r>
+    </w:p>
+    <w:p>
+      <w:pPr>
+        <w:pStyle w:val="af3"/>
+      </w:pPr>
+      <w:r>
+        <w:rPr>
           <w:b w:val="0"/>
-          <w:sz w:val="20"/>
         </w:rPr>
-        <w:t>原型设计（参考）</w:t>
-      </w:r>
-    </w:p>
-    <w:p>
+        <w:t>• 被测AddRmsNorm函数只使用本地Triton-Ascend JIT kernel。</w:t>
+      </w:r>
+    </w:p>
+    <w:p>
+      <w:pPr>
+        <w:pStyle w:val="af3"/>
+      </w:pPr>
       <w:r>
         <w:rPr>
-          <w:rFonts w:ascii="SimSun" w:hAnsi="SimSun" w:eastAsia="SimSun"/>
           <w:b w:val="0"/>
-          <w:sz w:val="20"/>
         </w:rPr>
-        <w:t>add_rms_norm(x1: Tensor, x2: Tensor, gamma: Tensor, epsilon: float = 1e-6) -&gt; Tensor</w:t>
+        <w:t>• Python封装只做元数据校验、输出/工作区分配和launch参数组织。</w:t>
+      </w:r>
+    </w:p>
+    <w:p>
+      <w:pPr>
+        <w:pStyle w:val="af3"/>
+      </w:pPr>
+      <w:r>
+        <w:rPr>
+          <w:b w:val="0"/>
+        </w:rPr>
+        <w:t>• 被测路径不调用PyTorch等价实现、torch_npu.npu_add_rms_norm、CANN/vendor AddRmsNorm、CPU fallback、任务golden路径、peer或其他后端代码。</w:t>
+      </w:r>
+    </w:p>
+    <w:p>
+      <w:pPr>
+        <w:pStyle w:val="af3"/>
+      </w:pPr>
+      <w:r>
+        <w:rPr>
+          <w:b w:val="0"/>
+        </w:rPr>
+        <w:t>• 实现根据运行时dtype/rank/shape/contiguity和hidden维能力边界选择路径，不根据case id、workload文件名、输入取值、输出模式或计时特征分支。</w:t>
+      </w:r>
+    </w:p>
+    <w:p>
+      <w:pPr>
+        <w:pStyle w:val="1"/>
+      </w:pPr>
+      <w:r>
+        <w:rPr>
+          <w:b/>
+        </w:rPr>
+        <w:t>6. 计时与性能</w:t>
+      </w:r>
+    </w:p>
+    <w:p>
+      <w:pPr>
+        <w:pStyle w:val="af3"/>
+      </w:pPr>
+      <w:r>
+        <w:rPr>
+          <w:b w:val="0"/>
+        </w:rPr>
+        <w:t>当前交付采用active-window作为主比较口径，kernel-sum作为诊断口径。active-window为同一Step Id内可见NPU kernel的max(end)-min(start)，case时间取measured step中位数；kernel-sum按kernel名聚合每步duration后取中位并求和。</w:t>
+      </w:r>
+    </w:p>
+    <w:p>
+      <w:pPr>
+        <w:pStyle w:val="af3"/>
+      </w:pPr>
+      <w:r>
+        <w:rPr>
+          <w:b w:val="0"/>
+        </w:rPr>
+        <w:t>三路均报告两个时间：Triton候选 active-window/kernel-sum 来自OpForge eval_20260612_155910 candidate-active-window probe；Torch语义实现和torch_npu helper来自交付JSONL中的baseline_active_window device_timeline。</w:t>
       </w:r>
     </w:p>
     <w:tbl>
@@ -172,105 +263,27 @@
         <w:tblLook w:firstColumn="1" w:firstRow="1" w:lastColumn="0" w:lastRow="0" w:noHBand="0" w:noVBand="1" w:val="04A0"/>
       </w:tblPr>
       <w:tblGrid>
-        <w:gridCol w:w="1837"/>
-        <w:gridCol w:w="1837"/>
-        <w:gridCol w:w="1837"/>
-        <w:gridCol w:w="1837"/>
-        <w:gridCol w:w="1837"/>
+        <w:gridCol w:w="4592"/>
+        <w:gridCol w:w="4592"/>
       </w:tblGrid>
       <w:tr>
         <w:tc>
           <w:tcPr>
-            <w:tcW w:type="dxa" w:w="1837"/>
+            <w:tcW w:type="dxa" w:w="4592"/>
           </w:tcPr>
           <w:p>
-            <w:pPr>
-              <w:jc w:val="center"/>
-            </w:pPr>
-            <w:r/>
             <w:r>
-              <w:rPr>
-                <w:rFonts w:ascii="SimSun" w:hAnsi="SimSun" w:eastAsia="SimSun"/>
-                <w:b/>
-                <w:sz w:val="18"/>
-              </w:rPr>
-              <w:t>名称</w:t>
+              <w:t>指标</w:t>
             </w:r>
           </w:p>
         </w:tc>
         <w:tc>
           <w:tcPr>
-            <w:tcW w:type="dxa" w:w="1837"/>
+            <w:tcW w:type="dxa" w:w="4592"/>
           </w:tcPr>
           <w:p>
-            <w:pPr>
-              <w:jc w:val="center"/>
-            </w:pPr>
-            <w:r/>
             <w:r>
-              <w:rPr>
-                <w:rFonts w:ascii="SimSun" w:hAnsi="SimSun" w:eastAsia="SimSun"/>
-                <w:b/>
-                <w:sz w:val="18"/>
-              </w:rPr>
-              <w:t>类别</w:t>
-            </w:r>
-          </w:p>
-        </w:tc>
-        <w:tc>
-          <w:tcPr>
-            <w:tcW w:type="dxa" w:w="1837"/>
-          </w:tcPr>
-          <w:p>
-            <w:pPr>
-              <w:jc w:val="center"/>
-            </w:pPr>
-            <w:r/>
-            <w:r>
-              <w:rPr>
-                <w:rFonts w:ascii="SimSun" w:hAnsi="SimSun" w:eastAsia="SimSun"/>
-                <w:b/>
-                <w:sz w:val="18"/>
-              </w:rPr>
-              <w:t>dtype</w:t>
-            </w:r>
-          </w:p>
-        </w:tc>
-        <w:tc>
-          <w:tcPr>
-            <w:tcW w:type="dxa" w:w="1837"/>
-          </w:tcPr>
-          <w:p>
-            <w:pPr>
-              <w:jc w:val="center"/>
-            </w:pPr>
-            <w:r/>
-            <w:r>
-              <w:rPr>
-                <w:rFonts w:ascii="SimSun" w:hAnsi="SimSun" w:eastAsia="SimSun"/>
-                <w:b/>
-                <w:sz w:val="18"/>
-              </w:rPr>
-              <w:t>shape</w:t>
-            </w:r>
-          </w:p>
-        </w:tc>
-        <w:tc>
-          <w:tcPr>
-            <w:tcW w:type="dxa" w:w="1837"/>
-          </w:tcPr>
-          <w:p>
-            <w:pPr>
-              <w:jc w:val="center"/>
-            </w:pPr>
-            <w:r/>
-            <w:r>
-              <w:rPr>
-                <w:rFonts w:ascii="SimSun" w:hAnsi="SimSun" w:eastAsia="SimSun"/>
-                <w:b/>
-                <w:sz w:val="18"/>
-              </w:rPr>
-              <w:t>介绍</w:t>
+              <w:t>数值</w:t>
             </w:r>
           </w:p>
         </w:tc>
@@ -278,96 +291,21 @@
       <w:tr>
         <w:tc>
           <w:tcPr>
-            <w:tcW w:type="dxa" w:w="1837"/>
+            <w:tcW w:type="dxa" w:w="4592"/>
           </w:tcPr>
           <w:p>
-            <w:pPr>
-              <w:jc w:val="left"/>
-            </w:pPr>
-            <w:r/>
             <w:r>
-              <w:rPr>
-                <w:rFonts w:ascii="SimSun" w:hAnsi="SimSun" w:eastAsia="SimSun"/>
-                <w:b w:val="0"/>
-                <w:sz w:val="18"/>
-              </w:rPr>
-              <w:t>x1</w:t>
+              <w:t>Triton 候选 active-window geomean</w:t>
             </w:r>
           </w:p>
         </w:tc>
         <w:tc>
           <w:tcPr>
-            <w:tcW w:type="dxa" w:w="1837"/>
+            <w:tcW w:type="dxa" w:w="4592"/>
           </w:tcPr>
           <w:p>
-            <w:pPr>
-              <w:jc w:val="left"/>
-            </w:pPr>
-            <w:r/>
             <w:r>
-              <w:rPr>
-                <w:rFonts w:ascii="SimSun" w:hAnsi="SimSun" w:eastAsia="SimSun"/>
-                <w:b w:val="0"/>
-                <w:sz w:val="18"/>
-              </w:rPr>
-              <w:t>输入</w:t>
-            </w:r>
-          </w:p>
-        </w:tc>
-        <w:tc>
-          <w:tcPr>
-            <w:tcW w:type="dxa" w:w="1837"/>
-          </w:tcPr>
-          <w:p>
-            <w:pPr>
-              <w:jc w:val="left"/>
-            </w:pPr>
-            <w:r/>
-            <w:r>
-              <w:rPr>
-                <w:rFonts w:ascii="SimSun" w:hAnsi="SimSun" w:eastAsia="SimSun"/>
-                <w:b w:val="0"/>
-                <w:sz w:val="18"/>
-              </w:rPr>
-              <w:t>bfloat16</w:t>
-            </w:r>
-          </w:p>
-        </w:tc>
-        <w:tc>
-          <w:tcPr>
-            <w:tcW w:type="dxa" w:w="1837"/>
-          </w:tcPr>
-          <w:p>
-            <w:pPr>
-              <w:jc w:val="left"/>
-            </w:pPr>
-            <w:r/>
-            <w:r>
-              <w:rPr>
-                <w:rFonts w:ascii="SimSun" w:hAnsi="SimSun" w:eastAsia="SimSun"/>
-                <w:b w:val="0"/>
-                <w:sz w:val="18"/>
-              </w:rPr>
-              <w:t>[B,S,H]</w:t>
-            </w:r>
-          </w:p>
-        </w:tc>
-        <w:tc>
-          <w:tcPr>
-            <w:tcW w:type="dxa" w:w="1837"/>
-          </w:tcPr>
-          <w:p>
-            <w:pPr>
-              <w:jc w:val="left"/>
-            </w:pPr>
-            <w:r/>
-            <w:r>
-              <w:rPr>
-                <w:rFonts w:ascii="SimSun" w:hAnsi="SimSun" w:eastAsia="SimSun"/>
-                <w:b w:val="0"/>
-                <w:sz w:val="18"/>
-              </w:rPr>
-              <w:t>计算输入Tensor</w:t>
+              <w:t>47.855 us</w:t>
             </w:r>
           </w:p>
         </w:tc>
@@ -375,96 +313,21 @@
       <w:tr>
         <w:tc>
           <w:tcPr>
-            <w:tcW w:type="dxa" w:w="1837"/>
+            <w:tcW w:type="dxa" w:w="4592"/>
           </w:tcPr>
           <w:p>
-            <w:pPr>
-              <w:jc w:val="left"/>
-            </w:pPr>
-            <w:r/>
             <w:r>
-              <w:rPr>
-                <w:rFonts w:ascii="SimSun" w:hAnsi="SimSun" w:eastAsia="SimSun"/>
-                <w:b w:val="0"/>
-                <w:sz w:val="18"/>
-              </w:rPr>
-              <w:t>x2</w:t>
+              <w:t>Triton 候选 kernel-sum geomean</w:t>
             </w:r>
           </w:p>
         </w:tc>
         <w:tc>
           <w:tcPr>
-            <w:tcW w:type="dxa" w:w="1837"/>
+            <w:tcW w:type="dxa" w:w="4592"/>
           </w:tcPr>
           <w:p>
-            <w:pPr>
-              <w:jc w:val="left"/>
-            </w:pPr>
-            <w:r/>
             <w:r>
-              <w:rPr>
-                <w:rFonts w:ascii="SimSun" w:hAnsi="SimSun" w:eastAsia="SimSun"/>
-                <w:b w:val="0"/>
-                <w:sz w:val="18"/>
-              </w:rPr>
-              <w:t>输入</w:t>
-            </w:r>
-          </w:p>
-        </w:tc>
-        <w:tc>
-          <w:tcPr>
-            <w:tcW w:type="dxa" w:w="1837"/>
-          </w:tcPr>
-          <w:p>
-            <w:pPr>
-              <w:jc w:val="left"/>
-            </w:pPr>
-            <w:r/>
-            <w:r>
-              <w:rPr>
-                <w:rFonts w:ascii="SimSun" w:hAnsi="SimSun" w:eastAsia="SimSun"/>
-                <w:b w:val="0"/>
-                <w:sz w:val="18"/>
-              </w:rPr>
-              <w:t>bfloat16</w:t>
-            </w:r>
-          </w:p>
-        </w:tc>
-        <w:tc>
-          <w:tcPr>
-            <w:tcW w:type="dxa" w:w="1837"/>
-          </w:tcPr>
-          <w:p>
-            <w:pPr>
-              <w:jc w:val="left"/>
-            </w:pPr>
-            <w:r/>
-            <w:r>
-              <w:rPr>
-                <w:rFonts w:ascii="SimSun" w:hAnsi="SimSun" w:eastAsia="SimSun"/>
-                <w:b w:val="0"/>
-                <w:sz w:val="18"/>
-              </w:rPr>
-              <w:t>[B,S,H]</w:t>
-            </w:r>
-          </w:p>
-        </w:tc>
-        <w:tc>
-          <w:tcPr>
-            <w:tcW w:type="dxa" w:w="1837"/>
-          </w:tcPr>
-          <w:p>
-            <w:pPr>
-              <w:jc w:val="left"/>
-            </w:pPr>
-            <w:r/>
-            <w:r>
-              <w:rPr>
-                <w:rFonts w:ascii="SimSun" w:hAnsi="SimSun" w:eastAsia="SimSun"/>
-                <w:b w:val="0"/>
-                <w:sz w:val="18"/>
-              </w:rPr>
-              <w:t>计算输入Tensor</w:t>
+              <w:t>20.180 us</w:t>
             </w:r>
           </w:p>
         </w:tc>
@@ -472,96 +335,21 @@
       <w:tr>
         <w:tc>
           <w:tcPr>
-            <w:tcW w:type="dxa" w:w="1837"/>
+            <w:tcW w:type="dxa" w:w="4592"/>
           </w:tcPr>
           <w:p>
-            <w:pPr>
-              <w:jc w:val="left"/>
-            </w:pPr>
-            <w:r/>
             <w:r>
-              <w:rPr>
-                <w:rFonts w:ascii="SimSun" w:hAnsi="SimSun" w:eastAsia="SimSun"/>
-                <w:b w:val="0"/>
-                <w:sz w:val="18"/>
-              </w:rPr>
-              <w:t>gamma</w:t>
+              <w:t>Torch 语义 active-window geomean</w:t>
             </w:r>
           </w:p>
         </w:tc>
         <w:tc>
           <w:tcPr>
-            <w:tcW w:type="dxa" w:w="1837"/>
+            <w:tcW w:type="dxa" w:w="4592"/>
           </w:tcPr>
           <w:p>
-            <w:pPr>
-              <w:jc w:val="left"/>
-            </w:pPr>
-            <w:r/>
             <w:r>
-              <w:rPr>
-                <w:rFonts w:ascii="SimSun" w:hAnsi="SimSun" w:eastAsia="SimSun"/>
-                <w:b w:val="0"/>
-                <w:sz w:val="18"/>
-              </w:rPr>
-              <w:t>输入</w:t>
-            </w:r>
-          </w:p>
-        </w:tc>
-        <w:tc>
-          <w:tcPr>
-            <w:tcW w:type="dxa" w:w="1837"/>
-          </w:tcPr>
-          <w:p>
-            <w:pPr>
-              <w:jc w:val="left"/>
-            </w:pPr>
-            <w:r/>
-            <w:r>
-              <w:rPr>
-                <w:rFonts w:ascii="SimSun" w:hAnsi="SimSun" w:eastAsia="SimSun"/>
-                <w:b w:val="0"/>
-                <w:sz w:val="18"/>
-              </w:rPr>
-              <w:t>bfloat16</w:t>
-            </w:r>
-          </w:p>
-        </w:tc>
-        <w:tc>
-          <w:tcPr>
-            <w:tcW w:type="dxa" w:w="1837"/>
-          </w:tcPr>
-          <w:p>
-            <w:pPr>
-              <w:jc w:val="left"/>
-            </w:pPr>
-            <w:r/>
-            <w:r>
-              <w:rPr>
-                <w:rFonts w:ascii="SimSun" w:hAnsi="SimSun" w:eastAsia="SimSun"/>
-                <w:b w:val="0"/>
-                <w:sz w:val="18"/>
-              </w:rPr>
-              <w:t>[B,S,H]</w:t>
-            </w:r>
-          </w:p>
-        </w:tc>
-        <w:tc>
-          <w:tcPr>
-            <w:tcW w:type="dxa" w:w="1837"/>
-          </w:tcPr>
-          <w:p>
-            <w:pPr>
-              <w:jc w:val="left"/>
-            </w:pPr>
-            <w:r/>
-            <w:r>
-              <w:rPr>
-                <w:rFonts w:ascii="SimSun" w:hAnsi="SimSun" w:eastAsia="SimSun"/>
-                <w:b w:val="0"/>
-                <w:sz w:val="18"/>
-              </w:rPr>
-              <w:t>归一化过程使用的权重</w:t>
+              <w:t>343.639 us</w:t>
             </w:r>
           </w:p>
         </w:tc>
@@ -569,96 +357,21 @@
       <w:tr>
         <w:tc>
           <w:tcPr>
-            <w:tcW w:type="dxa" w:w="1837"/>
+            <w:tcW w:type="dxa" w:w="4592"/>
           </w:tcPr>
           <w:p>
-            <w:pPr>
-              <w:jc w:val="left"/>
-            </w:pPr>
-            <w:r/>
             <w:r>
-              <w:rPr>
-                <w:rFonts w:ascii="SimSun" w:hAnsi="SimSun" w:eastAsia="SimSun"/>
-                <w:b w:val="0"/>
-                <w:sz w:val="18"/>
-              </w:rPr>
-              <w:t>epsilon</w:t>
+              <w:t>Torch 语义 kernel-sum geomean</w:t>
             </w:r>
           </w:p>
         </w:tc>
         <w:tc>
           <w:tcPr>
-            <w:tcW w:type="dxa" w:w="1837"/>
+            <w:tcW w:type="dxa" w:w="4592"/>
           </w:tcPr>
           <w:p>
-            <w:pPr>
-              <w:jc w:val="left"/>
-            </w:pPr>
-            <w:r/>
             <w:r>
-              <w:rPr>
-                <w:rFonts w:ascii="SimSun" w:hAnsi="SimSun" w:eastAsia="SimSun"/>
-                <w:b w:val="0"/>
-                <w:sz w:val="18"/>
-              </w:rPr>
-              <w:t>属性</w:t>
-            </w:r>
-          </w:p>
-        </w:tc>
-        <w:tc>
-          <w:tcPr>
-            <w:tcW w:type="dxa" w:w="1837"/>
-          </w:tcPr>
-          <w:p>
-            <w:pPr>
-              <w:jc w:val="left"/>
-            </w:pPr>
-            <w:r/>
-            <w:r>
-              <w:rPr>
-                <w:rFonts w:ascii="SimSun" w:hAnsi="SimSun" w:eastAsia="SimSun"/>
-                <w:b w:val="0"/>
-                <w:sz w:val="18"/>
-              </w:rPr>
-              <w:t>double</w:t>
-            </w:r>
-          </w:p>
-        </w:tc>
-        <w:tc>
-          <w:tcPr>
-            <w:tcW w:type="dxa" w:w="1837"/>
-          </w:tcPr>
-          <w:p>
-            <w:pPr>
-              <w:jc w:val="left"/>
-            </w:pPr>
-            <w:r/>
-            <w:r>
-              <w:rPr>
-                <w:rFonts w:ascii="SimSun" w:hAnsi="SimSun" w:eastAsia="SimSun"/>
-                <w:b w:val="0"/>
-                <w:sz w:val="18"/>
-              </w:rPr>
-              <w:t>-</w:t>
-            </w:r>
-          </w:p>
-        </w:tc>
-        <w:tc>
-          <w:tcPr>
-            <w:tcW w:type="dxa" w:w="1837"/>
-          </w:tcPr>
-          <w:p>
-            <w:pPr>
-              <w:jc w:val="left"/>
-            </w:pPr>
-            <w:r/>
-            <w:r>
-              <w:rPr>
-                <w:rFonts w:ascii="SimSun" w:hAnsi="SimSun" w:eastAsia="SimSun"/>
-                <w:b w:val="0"/>
-                <w:sz w:val="18"/>
-              </w:rPr>
-              <w:t>归一化过程中防止除0，默认值1e-6</w:t>
+              <w:t>106.451 us</w:t>
             </w:r>
           </w:p>
         </w:tc>
@@ -666,422 +379,277 @@
       <w:tr>
         <w:tc>
           <w:tcPr>
-            <w:tcW w:type="dxa" w:w="1837"/>
+            <w:tcW w:type="dxa" w:w="4592"/>
           </w:tcPr>
           <w:p>
-            <w:pPr>
-              <w:jc w:val="left"/>
-            </w:pPr>
-            <w:r/>
             <w:r>
-              <w:rPr>
-                <w:rFonts w:ascii="SimSun" w:hAnsi="SimSun" w:eastAsia="SimSun"/>
-                <w:b w:val="0"/>
-                <w:sz w:val="18"/>
-              </w:rPr>
-              <w:t>yOut</w:t>
+              <w:t>torch_npu helper active-window geomean</w:t>
             </w:r>
           </w:p>
         </w:tc>
         <w:tc>
           <w:tcPr>
-            <w:tcW w:type="dxa" w:w="1837"/>
+            <w:tcW w:type="dxa" w:w="4592"/>
           </w:tcPr>
           <w:p>
-            <w:pPr>
-              <w:jc w:val="left"/>
-            </w:pPr>
-            <w:r/>
             <w:r>
-              <w:rPr>
-                <w:rFonts w:ascii="SimSun" w:hAnsi="SimSun" w:eastAsia="SimSun"/>
-                <w:b w:val="0"/>
-                <w:sz w:val="18"/>
-              </w:rPr>
-              <w:t>输出</w:t>
+              <w:t>209.043 us</w:t>
+            </w:r>
+          </w:p>
+        </w:tc>
+      </w:tr>
+      <w:tr>
+        <w:tc>
+          <w:tcPr>
+            <w:tcW w:type="dxa" w:w="4592"/>
+          </w:tcPr>
+          <w:p>
+            <w:r>
+              <w:t>torch_npu helper kernel-sum geomean</w:t>
             </w:r>
           </w:p>
         </w:tc>
         <w:tc>
           <w:tcPr>
-            <w:tcW w:type="dxa" w:w="1837"/>
+            <w:tcW w:type="dxa" w:w="4592"/>
           </w:tcPr>
           <w:p>
-            <w:pPr>
-              <w:jc w:val="left"/>
-            </w:pPr>
-            <w:r/>
             <w:r>
-              <w:rPr>
-                <w:rFonts w:ascii="SimSun" w:hAnsi="SimSun" w:eastAsia="SimSun"/>
-                <w:b w:val="0"/>
-                <w:sz w:val="18"/>
-              </w:rPr>
-              <w:t>bfloat16</w:t>
+              <w:t>209.136 us</w:t>
+            </w:r>
+          </w:p>
+        </w:tc>
+      </w:tr>
+      <w:tr>
+        <w:tc>
+          <w:tcPr>
+            <w:tcW w:type="dxa" w:w="4592"/>
+          </w:tcPr>
+          <w:p>
+            <w:r>
+              <w:t>vs Torch 主加速比 active/active</w:t>
             </w:r>
           </w:p>
         </w:tc>
         <w:tc>
           <w:tcPr>
-            <w:tcW w:type="dxa" w:w="1837"/>
+            <w:tcW w:type="dxa" w:w="4592"/>
           </w:tcPr>
           <w:p>
-            <w:pPr>
-              <w:jc w:val="left"/>
-            </w:pPr>
-            <w:r/>
             <w:r>
-              <w:rPr>
-                <w:rFonts w:ascii="SimSun" w:hAnsi="SimSun" w:eastAsia="SimSun"/>
-                <w:b w:val="0"/>
-                <w:sz w:val="18"/>
-              </w:rPr>
-              <w:t>[B,S,H]</w:t>
+              <w:t>7.180762x</w:t>
+            </w:r>
+          </w:p>
+        </w:tc>
+      </w:tr>
+      <w:tr>
+        <w:tc>
+          <w:tcPr>
+            <w:tcW w:type="dxa" w:w="4592"/>
+          </w:tcPr>
+          <w:p>
+            <w:r>
+              <w:t>vs Torch 诊断加速比 kernel/kernel</w:t>
             </w:r>
           </w:p>
         </w:tc>
         <w:tc>
           <w:tcPr>
-            <w:tcW w:type="dxa" w:w="1837"/>
+            <w:tcW w:type="dxa" w:w="4592"/>
           </w:tcPr>
           <w:p>
-            <w:pPr>
-              <w:jc w:val="left"/>
-            </w:pPr>
-            <w:r/>
             <w:r>
-              <w:rPr>
-                <w:rFonts w:ascii="SimSun" w:hAnsi="SimSun" w:eastAsia="SimSun"/>
-                <w:b w:val="0"/>
-                <w:sz w:val="18"/>
-              </w:rPr>
-              <w:t>输入相加并归一化后的结果</w:t>
+              <w:t>5.275206x</w:t>
+            </w:r>
+          </w:p>
+        </w:tc>
+      </w:tr>
+      <w:tr>
+        <w:tc>
+          <w:tcPr>
+            <w:tcW w:type="dxa" w:w="4592"/>
+          </w:tcPr>
+          <w:p>
+            <w:r>
+              <w:t>vs Torch 诊断 baseline-active/candidate-kernel</w:t>
+            </w:r>
+          </w:p>
+        </w:tc>
+        <w:tc>
+          <w:tcPr>
+            <w:tcW w:type="dxa" w:w="4592"/>
+          </w:tcPr>
+          <w:p>
+            <w:r>
+              <w:t>17.029071x</w:t>
+            </w:r>
+          </w:p>
+        </w:tc>
+      </w:tr>
+      <w:tr>
+        <w:tc>
+          <w:tcPr>
+            <w:tcW w:type="dxa" w:w="4592"/>
+          </w:tcPr>
+          <w:p>
+            <w:r>
+              <w:t>vs Torch 诊断 baseline-kernel/candidate-active</w:t>
+            </w:r>
+          </w:p>
+        </w:tc>
+        <w:tc>
+          <w:tcPr>
+            <w:tcW w:type="dxa" w:w="4592"/>
+          </w:tcPr>
+          <w:p>
+            <w:r>
+              <w:t>2.224432x</w:t>
+            </w:r>
+          </w:p>
+        </w:tc>
+      </w:tr>
+      <w:tr>
+        <w:tc>
+          <w:tcPr>
+            <w:tcW w:type="dxa" w:w="4592"/>
+          </w:tcPr>
+          <w:p>
+            <w:r>
+              <w:t>vs torch_npu PASS 子集主加速比 active/active</w:t>
+            </w:r>
+          </w:p>
+        </w:tc>
+        <w:tc>
+          <w:tcPr>
+            <w:tcW w:type="dxa" w:w="4592"/>
+          </w:tcPr>
+          <w:p>
+            <w:r>
+              <w:t>3.271697x</w:t>
+            </w:r>
+          </w:p>
+        </w:tc>
+      </w:tr>
+      <w:tr>
+        <w:tc>
+          <w:tcPr>
+            <w:tcW w:type="dxa" w:w="4592"/>
+          </w:tcPr>
+          <w:p>
+            <w:r>
+              <w:t>vs torch_npu PASS 子集诊断加速比 kernel/kernel</w:t>
+            </w:r>
+          </w:p>
+        </w:tc>
+        <w:tc>
+          <w:tcPr>
+            <w:tcW w:type="dxa" w:w="4592"/>
+          </w:tcPr>
+          <w:p>
+            <w:r>
+              <w:t>9.813551x</w:t>
+            </w:r>
+          </w:p>
+        </w:tc>
+      </w:tr>
+      <w:tr>
+        <w:tc>
+          <w:tcPr>
+            <w:tcW w:type="dxa" w:w="4592"/>
+          </w:tcPr>
+          <w:p>
+            <w:r>
+              <w:t>选中基线主加速比 active/active</w:t>
+            </w:r>
+          </w:p>
+        </w:tc>
+        <w:tc>
+          <w:tcPr>
+            <w:tcW w:type="dxa" w:w="4592"/>
+          </w:tcPr>
+          <w:p>
+            <w:r>
+              <w:t>4.716968x</w:t>
+            </w:r>
+          </w:p>
+        </w:tc>
+      </w:tr>
+      <w:tr>
+        <w:tc>
+          <w:tcPr>
+            <w:tcW w:type="dxa" w:w="4592"/>
+          </w:tcPr>
+          <w:p>
+            <w:r>
+              <w:t>选中基线诊断加速比 kernel/kernel</w:t>
+            </w:r>
+          </w:p>
+        </w:tc>
+        <w:tc>
+          <w:tcPr>
+            <w:tcW w:type="dxa" w:w="4592"/>
+          </w:tcPr>
+          <w:p>
+            <w:r>
+              <w:t>8.498617x</w:t>
             </w:r>
           </w:p>
         </w:tc>
       </w:tr>
     </w:tbl>
     <w:p>
+      <w:pPr>
+        <w:pStyle w:val="af3"/>
+      </w:pPr>
       <w:r>
         <w:rPr>
-          <w:rFonts w:ascii="SimSun" w:hAnsi="SimSun" w:eastAsia="SimSun"/>
           <w:b w:val="0"/>
-          <w:sz w:val="20"/>
         </w:rPr>
-        <w:t>相关约束</w:t>
-      </w:r>
-    </w:p>
-    <w:p>
-      <w:pPr>
-        <w:pStyle w:val="af9"/>
+        <w:t>Speedup矩阵字段：active/active为主比较；kernel/kernel、baseline-active/candidate-kernel、baseline-kernel/candidate-active为诊断比较。torch_npu helper只在61/80个精度通过case上作为NPU helper基线；选中基线规则为torch_npu通过则选torch_npu，否则选Torch语义实现。</w:t>
+      </w:r>
+    </w:p>
+    <w:p>
+      <w:pPr>
+        <w:pStyle w:val="af3"/>
       </w:pPr>
       <w:r>
         <w:rPr>
-          <w:rFonts w:ascii="SimSun" w:hAnsi="SimSun" w:eastAsia="SimSun"/>
-          <w:sz w:val="20"/>
+          <w:b w:val="0"/>
         </w:rPr>
-        <w:t>B表示Batch，S表示Sequence Length，H表示HiddenSize。</w:t>
-      </w:r>
-    </w:p>
-    <w:p>
-      <w:pPr>
-        <w:pStyle w:val="af9"/>
+        <w:t>历史评测器summary eval_20260612_155910的状态为PERF_REGRESSION，80/80正确，旧字段中的geomean speedup为8.269904x。该字段来自active-window重构前的候选kernel-sum统计；当前交付报告同时给出active-window和kernel-sum两套比较。</w:t>
+      </w:r>
+    </w:p>
+    <w:p>
+      <w:pPr>
+        <w:pStyle w:val="1"/>
       </w:pPr>
       <w:r>
         <w:rPr>
-          <w:rFonts w:ascii="SimSun" w:hAnsi="SimSun" w:eastAsia="SimSun"/>
-          <w:sz w:val="20"/>
+          <w:b/>
         </w:rPr>
-        <w:t>支持主流推理场景B in {1,8,16,32,64}，H in {3584,4096,5120,8192}，验证材料扩展S in {1,8,32,128}形成80个公开风格用例。</w:t>
-      </w:r>
-    </w:p>
-    <w:p>
-      <w:pPr>
-        <w:pStyle w:val="af9"/>
+        <w:t>7. 风险与后续优化</w:t>
+      </w:r>
+    </w:p>
+    <w:p>
+      <w:pPr>
+        <w:pStyle w:val="af3"/>
       </w:pPr>
       <w:r>
         <w:rPr>
-          <w:rFonts w:ascii="SimSun" w:hAnsi="SimSun" w:eastAsia="SimSun"/>
-          <w:sz w:val="20"/>
+          <w:b w:val="0"/>
         </w:rPr>
-        <w:t>实现不根据公开case id、workload文件名、输入取值、输出模式或计时特征分支。</w:t>
-      </w:r>
-    </w:p>
-    <w:p>
-      <w:pPr>
-        <w:pStyle w:val="1"/>
+        <w:t>• 小尺寸双kernel路径的active-window会体现kernel间隙，例如case 3 kernel-sum为6.700 us，active-window为121.500 us。</w:t>
+      </w:r>
+    </w:p>
+    <w:p>
+      <w:pPr>
+        <w:pStyle w:val="af3"/>
       </w:pPr>
       <w:r>
         <w:rPr>
-          <w:rFonts w:ascii="SimSun" w:hAnsi="SimSun" w:eastAsia="SimSun"/>
           <w:b w:val="0"/>
-          <w:sz w:val="20"/>
         </w:rPr>
-        <w:t>需求详细设计（重点）</w:t>
-      </w:r>
-    </w:p>
-    <w:p>
-      <w:pPr>
-        <w:pStyle w:val="2"/>
-      </w:pPr>
-      <w:r>
-        <w:rPr>
-          <w:rFonts w:ascii="SimSun" w:hAnsi="SimSun" w:eastAsia="SimSun"/>
-          <w:b w:val="0"/>
-          <w:sz w:val="20"/>
-        </w:rPr>
-        <w:t>需求总体设计</w:t>
-      </w:r>
-    </w:p>
-    <w:p>
-      <w:r>
-        <w:rPr>
-          <w:rFonts w:ascii="SimSun" w:hAnsi="SimSun" w:eastAsia="SimSun"/>
-          <w:b w:val="0"/>
-          <w:sz w:val="20"/>
-        </w:rPr>
-        <w:t>算子设计</w:t>
-      </w:r>
-    </w:p>
-    <w:p>
-      <w:pPr>
-        <w:pStyle w:val="af9"/>
-      </w:pPr>
-      <w:r>
-        <w:rPr>
-          <w:rFonts w:ascii="SimSun" w:hAnsi="SimSun" w:eastAsia="SimSun"/>
-          <w:sz w:val="20"/>
-        </w:rPr>
-        <w:t>H &lt;= 4096：使用单个融合Triton kernel，一次加载x1、x2、gamma，在FP32中完成加法、平方和归约、rstd计算以及BF16输出写回。</w:t>
-      </w:r>
-    </w:p>
-    <w:p>
-      <w:pPr>
-        <w:pStyle w:val="af9"/>
-      </w:pPr>
-      <w:r>
-        <w:rPr>
-          <w:rFonts w:ascii="SimSun" w:hAnsi="SimSun" w:eastAsia="SimSun"/>
-          <w:sz w:val="20"/>
-        </w:rPr>
-        <w:t>4096 &lt; H且next_power_of_2(H) &lt;= 8192：使用两个Triton kernel，第一阶段计算每个row的FP32 rstd，第二阶段重新加载输入并写出yOut。该路径降低融合8192宽kernel的片上临时量压力。</w:t>
-      </w:r>
-    </w:p>
-    <w:p>
-      <w:pPr>
-        <w:pStyle w:val="af9"/>
-      </w:pPr>
-      <w:r>
-        <w:rPr>
-          <w:rFonts w:ascii="SimSun" w:hAnsi="SimSun" w:eastAsia="SimSun"/>
-          <w:sz w:val="20"/>
-        </w:rPr>
-        <w:t>next_power_of_2(H) &gt; 8192：使用同后端分块路径，先按8192 hidden元素计算partial sum，再归约得到每行rstd，最后分块apply并写出yOut。该路径用于覆盖H=8320等泛化审计形状。</w:t>
-      </w:r>
-    </w:p>
-    <w:p>
-      <w:r>
-        <w:rPr>
-          <w:rFonts w:ascii="SimSun" w:hAnsi="SimSun" w:eastAsia="SimSun"/>
-          <w:b w:val="0"/>
-          <w:sz w:val="20"/>
-        </w:rPr>
-        <w:t>优化思路与策略，以及实现方法</w:t>
-      </w:r>
-    </w:p>
-    <w:p>
-      <w:pPr>
-        <w:pStyle w:val="af9"/>
-      </w:pPr>
-      <w:r>
-        <w:rPr>
-          <w:rFonts w:ascii="SimSun" w:hAnsi="SimSun" w:eastAsia="SimSun"/>
-          <w:sz w:val="20"/>
-        </w:rPr>
-        <w:t>沿hidden维连续访存，保证每个program处理一行或一个连续hidden分块，减少离散访存开销。</w:t>
-      </w:r>
-    </w:p>
-    <w:p>
-      <w:pPr>
-        <w:pStyle w:val="af9"/>
-      </w:pPr>
-      <w:r>
-        <w:rPr>
-          <w:rFonts w:ascii="SimSun" w:hAnsi="SimSun" w:eastAsia="SimSun"/>
-          <w:sz w:val="20"/>
-        </w:rPr>
-        <w:t>归一化统计量使用FP32累加，兼顾BF16输入输出下的L1精度要求。</w:t>
-      </w:r>
-    </w:p>
-    <w:p>
-      <w:pPr>
-        <w:pStyle w:val="af9"/>
-      </w:pPr>
-      <w:r>
-        <w:rPr>
-          <w:rFonts w:ascii="SimSun" w:hAnsi="SimSun" w:eastAsia="SimSun"/>
-          <w:sz w:val="20"/>
-        </w:rPr>
-        <w:t>小H采用融合路径减少kernel launch和全局内存中间结果；较大H采用拆分路径控制Triton-Ascend/BiShengIR片上资源压力。</w:t>
-      </w:r>
-    </w:p>
-    <w:p>
-      <w:pPr>
-        <w:pStyle w:val="af9"/>
-      </w:pPr>
-      <w:r>
-        <w:rPr>
-          <w:rFonts w:ascii="SimSun" w:hAnsi="SimSun" w:eastAsia="SimSun"/>
-          <w:sz w:val="20"/>
-        </w:rPr>
-        <w:t>宽H采用partial-sum/reduce/apply三阶段分块设计，避免把公开H集合写成硬编码能力边界。</w:t>
-      </w:r>
-    </w:p>
-    <w:p>
-      <w:pPr>
-        <w:pStyle w:val="2"/>
-      </w:pPr>
-      <w:r>
-        <w:rPr>
-          <w:rFonts w:ascii="SimSun" w:hAnsi="SimSun" w:eastAsia="SimSun"/>
-          <w:b w:val="0"/>
-          <w:sz w:val="20"/>
-        </w:rPr>
-        <w:t>算子约束限制</w:t>
-      </w:r>
-    </w:p>
-    <w:p>
-      <w:pPr>
-        <w:pStyle w:val="af9"/>
-      </w:pPr>
-      <w:r>
-        <w:rPr>
-          <w:rFonts w:ascii="SimSun" w:hAnsi="SimSun" w:eastAsia="SimSun"/>
-          <w:sz w:val="20"/>
-        </w:rPr>
-        <w:t>输入必须为rank-3、连续ND布局、BF16、NPU Tensor，且x1/x2/gamma形状完全一致。</w:t>
-      </w:r>
-    </w:p>
-    <w:p>
-      <w:pPr>
-        <w:pStyle w:val="af9"/>
-      </w:pPr>
-      <w:r>
-        <w:rPr>
-          <w:rFonts w:ascii="SimSun" w:hAnsi="SimSun" w:eastAsia="SimSun"/>
-          <w:sz w:val="20"/>
-        </w:rPr>
-        <w:t>epsilon必须大于0。</w:t>
-      </w:r>
-    </w:p>
-    <w:p>
-      <w:pPr>
-        <w:pStyle w:val="af9"/>
-      </w:pPr>
-      <w:r>
-        <w:rPr>
-          <w:rFonts w:ascii="SimSun" w:hAnsi="SimSun" w:eastAsia="SimSun"/>
-          <w:sz w:val="20"/>
-        </w:rPr>
-        <w:t>极大H场景可能受到workspace大小和chunk数量上限影响；当前交付覆盖需求主流shape及已执行的40个泛化审计case。</w:t>
-      </w:r>
-    </w:p>
-    <w:p>
-      <w:pPr>
-        <w:pStyle w:val="af9"/>
-      </w:pPr>
-      <w:r>
-        <w:rPr>
-          <w:rFonts w:ascii="SimSun" w:hAnsi="SimSun" w:eastAsia="SimSun"/>
-          <w:sz w:val="20"/>
-        </w:rPr>
-        <w:t>被测路径不得调用PyTorch等价计算、torch_npu.npu_add_rms_norm、CANN/vendor AddRmsNorm、CPU fallback、任务golden代码或其他后端解法。</w:t>
-      </w:r>
-    </w:p>
-    <w:p>
-      <w:pPr>
-        <w:pStyle w:val="1"/>
-      </w:pPr>
-      <w:r>
-        <w:rPr>
-          <w:rFonts w:ascii="SimSun" w:hAnsi="SimSun" w:eastAsia="SimSun"/>
-          <w:b w:val="0"/>
-          <w:sz w:val="20"/>
-        </w:rPr>
-        <w:t>可维可测分析</w:t>
-      </w:r>
-    </w:p>
-    <w:p>
-      <w:pPr>
-        <w:pStyle w:val="2"/>
-      </w:pPr>
-      <w:r>
-        <w:rPr>
-          <w:rFonts w:ascii="SimSun" w:hAnsi="SimSun" w:eastAsia="SimSun"/>
-          <w:b w:val="0"/>
-          <w:sz w:val="20"/>
-        </w:rPr>
-        <w:t>精度标准/性能标准</w:t>
-      </w:r>
-    </w:p>
-    <w:p>
-      <w:pPr>
-        <w:pStyle w:val="af9"/>
-      </w:pPr>
-      <w:r>
-        <w:rPr>
-          <w:rFonts w:ascii="SimSun" w:hAnsi="SimSun" w:eastAsia="SimSun"/>
-          <w:sz w:val="20"/>
-        </w:rPr>
-        <w:t>精度标准：按照BF16 L1级别精度口径检查，阈值为2^-7 = 0.0078125；普通数值位置要求MERE &lt; threshold且MARE &lt; 10 * threshold。</w:t>
-      </w:r>
-    </w:p>
-    <w:p>
-      <w:pPr>
-        <w:pStyle w:val="af9"/>
-      </w:pPr>
-      <w:r>
-        <w:rPr>
-          <w:rFonts w:ascii="SimSun" w:hAnsi="SimSun" w:eastAsia="SimSun"/>
-          <w:sz w:val="20"/>
-        </w:rPr>
-        <w:t>公开评测：OpForge CANN-Bench run eval_20260612_155910，80/80用例正确，失败用例0，total mismatch count为0，max MARE为0.007812499609375021，max diff为0.015625。</w:t>
-      </w:r>
-    </w:p>
-    <w:p>
-      <w:pPr>
-        <w:pStyle w:val="af9"/>
-      </w:pPr>
-      <w:r>
-        <w:rPr>
-          <w:rFonts w:ascii="SimSun" w:hAnsi="SimSun" w:eastAsia="SimSun"/>
-          <w:sz w:val="20"/>
-        </w:rPr>
-        <w:t>性能结果：整体校准geomean speedup为8.269904x，平均耗时56.786125 us，中位耗时15.550000 us，P95耗时225.166000 us。</w:t>
-      </w:r>
-    </w:p>
-    <w:p>
-      <w:pPr>
-        <w:pStyle w:val="af9"/>
-      </w:pPr>
-      <w:r>
-        <w:rPr>
-          <w:rFonts w:ascii="SimSun" w:hAnsi="SimSun" w:eastAsia="SimSun"/>
-          <w:sz w:val="20"/>
-        </w:rPr>
-        <w:t>基线来源：21个用例使用torch_npu.npu_add_rms_norm任务NPU基线，geomean speedup为3.356045x；59个用例使用PyTorch语义fallback基线，geomean speedup为11.400119x。对外表述时需明确该基线来源拆分。</w:t>
-      </w:r>
-    </w:p>
-    <w:p>
-      <w:pPr>
-        <w:pStyle w:val="af9"/>
-      </w:pPr>
-      <w:r>
-        <w:rPr>
-          <w:rFonts w:ascii="SimSun" w:hAnsi="SimSun" w:eastAsia="SimSun"/>
-          <w:sz w:val="20"/>
-        </w:rPr>
-        <w:t>泛化审计：manual_generalization_audit_40_fixed_20260612_155512，40/40通过，失败用例0。</w:t>
+        <w:t>• 当前评测器状态仍为PERF_REGRESSION，后续重点是降低小尺寸active-window和双kernel gap。</w:t>
       </w:r>
     </w:p>
     <w:sectPr>

</xml_diff>

<commit_message>
docs: add seeded add rms norm generalization evidence
</commit_message>
<xml_diff>
--- a/third_party/ascend/tutorials/add_rms_norm/AddRmsNorm算子设计方案.docx
+++ b/third_party/ascend/tutorials/add_rms_norm/AddRmsNorm算子设计方案.docx
@@ -162,10 +162,7 @@
         <w:pStyle w:val="af3"/>
       </w:pPr>
       <w:r>
-        <w:rPr>
-          <w:b w:val="0"/>
-        </w:rPr>
-        <w:t>验证脚本复刻BF16检查口径：阈值为2^-7 = 0.0078125，普通位置要求MERE &lt; threshold且MARE &lt; 10 * threshold，小值或抵消位置使用checker的ErrorCount规则。Triton候选在80个公开风格case上80/80通过；手动泛化审计manual_generalization_audit_40_fixed_20260612_155512为40/40通过。</w:t>
+        <w:t>验证脚本复刻BF16检查口径：阈值为2^-7 = 0.0078125，普通位置要求MERE &lt; threshold且MARE &lt; 10 * threshold，小值或抵消位置使用checker的ErrorCount规则。Triton候选在80个公开风格case上80/80通过；交付目录新增固定seed随机泛化验证，40个非公开shape case为40/40通过，旧的10个手写near-public/boundary case不再作为交付证据。</w:t>
       </w:r>
     </w:p>
     <w:p>

</xml_diff>